<commit_message>
Refine hardware plan for manual measurement focus
</commit_message>
<xml_diff>
--- a/three_phase_hw_replacement_plan_simplified.docx
+++ b/three_phase_hw_replacement_plan_simplified.docx
@@ -20,13 +20,7 @@
         <w:jc w:val="center"/>
       </w:pPr>
       <w:r>
-        <w:rPr>
-          <w:rFonts w:ascii="Arial" w:hAnsi="Arial" w:eastAsia="Microsoft YaHei"/>
-          <w:b/>
-          <w:color w:val="1F4E79"/>
-          <w:sz w:val="36"/>
-        </w:rPr>
-        <w:t>硬件替代计划（L1/L2 与 V1/V2 聚焦版）</w:t>
+        <w:t>硬件替代计划（L1/L2 手动硬件化聚焦版）</w:t>
       </w:r>
     </w:p>
     <w:tbl>
@@ -70,17 +64,8 @@
             <w:vAlign w:val="center"/>
           </w:tcPr>
           <w:p>
-            <w:pPr>
-              <w:spacing w:after="0"/>
-            </w:pPr>
-            <w:r/>
             <w:r>
-              <w:rPr>
-                <w:rFonts w:ascii="Arial" w:hAnsi="Arial" w:eastAsia="Microsoft YaHei"/>
-                <w:b w:val="0"/>
-                <w:sz w:val="19"/>
-              </w:rPr>
-              <w:t>V0.3 L1/L2 聚焦更新版</w:t>
+              <w:t>V0.4 L1/L2 手动硬件化聚焦版</w:t>
             </w:r>
           </w:p>
         </w:tc>
@@ -205,14 +190,15 @@
             <w:pPr>
               <w:spacing w:after="0"/>
             </w:pPr>
-            <w:r/>
+            <w:r>
+              <w:t>只展开 L1 操作硬件化、L2 测量硬件化，以及 V1/V2 阶段边界；自动采集统一归入后续扩展功能。</w:t>
+            </w:r>
             <w:r>
               <w:rPr>
                 <w:rFonts w:ascii="Arial" w:hAnsi="Arial" w:eastAsia="Microsoft YaHei"/>
                 <w:b w:val="0"/>
                 <w:sz w:val="19"/>
               </w:rPr>
-              <w:t>只展开 L1 操作硬件化、L2 测量硬件化，以及 V1/V2 阶段边界。</w:t>
             </w:r>
           </w:p>
         </w:tc>
@@ -293,11 +279,10 @@
                 <w:sz w:val="21"/>
               </w:rPr>
               <w:t>本版定位</w:t>
+              <w:br/>
+              <w:t>本文件用于冻结硬件化的近期讨论边界。V1/V2 的核心目标是实体操作与真实端子手动测量闭环；这已经可以大致满足硬件化训练需求。自动采集主要用于提升便利性和考核严谨性，统一放入后续扩展功能。主文不展开 L3/L4 的详细方案；L3/L4 仅在后续扩展边界中说明必须提前遵守的约束。硬件开发可以从 L1/L2 的 IO 点、端子布局、安全约束和适配层语义开始。</w:t>
             </w:r>
-            <w:r>
-              <w:br/>
-              <w:t>本文件用于冻结硬件化的近期讨论边界。主文不展开 L3/L4 的详细方案；L3/L4 仅在后续扩展边界中说明必须提前遵守的约束。硬件开发可以从 L1/L2 的 IO 点、端子布局、安全约束和适配层语义开始。</w:t>
-            </w:r>
+            <w:r/>
           </w:p>
         </w:tc>
       </w:tr>
@@ -349,7 +334,7 @@
         <w:spacing w:after="40"/>
       </w:pPr>
       <w:r>
-        <w:t>V2 是测量硬件化增强层，不等于一次性完成所有自动采集。</w:t>
+        <w:t>V2 是测量硬件化完善层，重点仍是低压端子、测量指引、手动录入口径和故障现象可测；自动采集不作为 V2 必选项。</w:t>
       </w:r>
     </w:p>
     <w:tbl>
@@ -668,14 +653,15 @@
             <w:pPr>
               <w:spacing w:after="0"/>
             </w:pPr>
-            <w:r/>
+            <w:r>
+              <w:t>自动采集、表笔识别和状态码上传统一归入后续扩展功能，不作为 V1/V2 的前置条件。</w:t>
+            </w:r>
             <w:r>
               <w:rPr>
                 <w:rFonts w:ascii="Arial" w:hAnsi="Arial" w:eastAsia="Microsoft YaHei"/>
                 <w:b w:val="0"/>
                 <w:sz w:val="19"/>
               </w:rPr>
-              <w:t>不要求 V2 一次性实现通断、线电压、相序、压差和表笔识别全部自动化。</w:t>
             </w:r>
           </w:p>
         </w:tc>
@@ -1445,7 +1431,7 @@
     </w:p>
     <w:p>
       <w:r>
-        <w:t>L2 的目标是让学生面对真实标注端子，使用普通万用表或相序仪完成测量动作，并由上位机保存结构化测量记录。L2 不等于一开始就实现全自动采集；V1 的重点是手动测量闭环，V2 才选择性增强自动采集。</w:t>
+        <w:t>L2 的目标是让学生面对真实标注端子，使用普通万用表或相序仪完成测量动作，并由上位机保存结构化测量记录。L2 不等于一开始就实现全自动采集；V1 的重点是手动测量闭环，自动采集转入后续扩展功能。</w:t>
       </w:r>
     </w:p>
     <w:tbl>
@@ -1808,11 +1794,10 @@
                 <w:sz w:val="21"/>
               </w:rPr>
               <w:t>V2 新表述</w:t>
+              <w:br/>
+              <w:t>V2 定义为“测量硬件化完善”：在 V1 手动测量闭环基础上，继续完善低压端子、测量指引、手动录入口径和故障现象可测性。自动采集、通断自动检测、相序自动识别和表笔识别统一归入后续扩展功能，不作为 V2 必选项。</w:t>
             </w:r>
-            <w:r>
-              <w:br/>
-              <w:t>V2 定义为“测量硬件化增强”：在 V1 手动测量闭环基础上，选择性加入自动采集能力。优先对象为 PT 线电压和 PT 二次端子压差；通断检测、相序自动识别和表笔识别作为可选增强，不作为 V2 必选项。</w:t>
-            </w:r>
+            <w:r/>
           </w:p>
         </w:tc>
       </w:tr>
@@ -1842,7 +1827,7 @@
         <w:spacing w:after="40"/>
       </w:pPr>
       <w:r>
-        <w:t>V2 自动上传时使用 origin="hardware"，但不能破坏 V1 的 origin="manual" 闭环。</w:t>
+        <w:t>后续自动上传时使用 origin="hardware"，但不能破坏 V1/V2 的 origin="manual" 手动测量闭环。</w:t>
       </w:r>
     </w:p>
     <w:p>
@@ -1851,7 +1836,7 @@
         <w:spacing w:after="40"/>
       </w:pPr>
       <w:r>
-        <w:t>自动采集只增强考核严谨性，不应成为 V1 落地的前置条件。</w:t>
+        <w:t>自动采集只增强便利性和考核严谨性，不应成为 V1/V2 硬件化闭环的前置条件。</w:t>
       </w:r>
     </w:p>
     <w:p>
@@ -2077,14 +2062,15 @@
             <w:pPr>
               <w:spacing w:after="0"/>
             </w:pPr>
-            <w:r/>
+            <w:r>
+              <w:t>在 V1 基础上完善真实端子测量和手动录入闭环。</w:t>
+            </w:r>
             <w:r>
               <w:rPr>
                 <w:rFonts w:ascii="Arial" w:hAnsi="Arial" w:eastAsia="Microsoft YaHei"/>
                 <w:b w:val="0"/>
                 <w:sz w:val="19"/>
               </w:rPr>
-              <w:t>在 V1 基础上选择性增强测量硬件化。</w:t>
             </w:r>
           </w:p>
         </w:tc>
@@ -2097,14 +2083,15 @@
             <w:pPr>
               <w:spacing w:after="0"/>
             </w:pPr>
-            <w:r/>
+            <w:r>
+              <w:t>PT 低压信号源稳定、测量端子清晰、手动录入口径明确、故障现象可由普通仪表测得。</w:t>
+            </w:r>
             <w:r>
               <w:rPr>
                 <w:rFonts w:ascii="Arial" w:hAnsi="Arial" w:eastAsia="Microsoft YaHei"/>
                 <w:b w:val="0"/>
                 <w:sz w:val="19"/>
               </w:rPr>
-              <w:t>PT 低压信号源稳定、PT 线电压与端子压差优先自动采集、硬件上传接口预留。</w:t>
             </w:r>
           </w:p>
         </w:tc>
@@ -2117,14 +2104,15 @@
             <w:pPr>
               <w:spacing w:after="0"/>
             </w:pPr>
-            <w:r/>
+            <w:r>
+              <w:t>自动采集、通断自动检测、相序自动识别、表笔插入检测、端子编码、防误填机制。</w:t>
+            </w:r>
             <w:r>
               <w:rPr>
                 <w:rFonts w:ascii="Arial" w:hAnsi="Arial" w:eastAsia="Microsoft YaHei"/>
                 <w:b w:val="0"/>
                 <w:sz w:val="19"/>
               </w:rPr>
-              <w:t>通断自动检测、相序自动识别、表笔插入检测、端子编码、防误填机制。</w:t>
             </w:r>
           </w:p>
         </w:tc>
@@ -2133,7 +2121,7 @@
     <w:p/>
     <w:p>
       <w:r>
-        <w:t>V2 可以继续按成本、风险和教学价值拆成若干子阶段，而不是一次性完成全部自动化：</w:t>
+        <w:t>后续扩展功能可以继续按成本、风险和教学价值拆成若干子阶段，而不是一次性完成全部自动化：</w:t>
       </w:r>
     </w:p>
     <w:p>
@@ -2142,7 +2130,7 @@
         <w:spacing w:after="40"/>
       </w:pPr>
       <w:r>
-        <w:t>V2.1：优先实现 PT 线电压和 PT 二次端子压差的自动采集准备。</w:t>
+        <w:t>扩展 1：优先评估 PT 线电压和 PT 二次端子压差的自动采集。</w:t>
       </w:r>
     </w:p>
     <w:p>
@@ -2151,7 +2139,7 @@
         <w:spacing w:after="40"/>
       </w:pPr>
       <w:r>
-        <w:t>V2.2：按需要加入通断自动检测。</w:t>
+        <w:t>扩展 2：按需要加入通断自动检测。</w:t>
       </w:r>
     </w:p>
     <w:p>
@@ -2160,7 +2148,7 @@
         <w:spacing w:after="40"/>
       </w:pPr>
       <w:r>
-        <w:t>V2.3：按需要加入相序自动识别。</w:t>
+        <w:t>扩展 3：按需要加入相序自动识别。</w:t>
       </w:r>
     </w:p>
     <w:p>
@@ -2169,7 +2157,7 @@
         <w:spacing w:after="40"/>
       </w:pPr>
       <w:r>
-        <w:t>V2.4：按考核严格程度决定是否加入表笔识别、端子编码和防误填。</w:t>
+        <w:t>扩展 4：按考核严格程度决定是否加入表笔识别、端子编码和防误填。</w:t>
       </w:r>
     </w:p>
     <w:p>
@@ -2584,7 +2572,7 @@
         <w:spacing w:after="40"/>
       </w:pPr>
       <w:r>
-        <w:t>后续是否实现 L3/L4，应在 V1/V2 验收后根据教学价值、成本和安全风险单独决策。</w:t>
+        <w:t>后续是否实现自动采集、L3/L4，应在 V1/V2 手动硬件化闭环验收后，根据教学价值、成本和安全风险单独决策。</w:t>
       </w:r>
     </w:p>
     <w:p>
@@ -2597,7 +2585,7 @@
     </w:p>
     <w:p>
       <w:r>
-        <w:t>可以开始考虑硬件化，但建议先从“设计输入冻结”开始，而不是马上决定具体开发板型号或画板级原理图。</w:t>
+        <w:t>可以开始考虑硬件化。当前判断是：手动测量闭环已经可以大致满足硬件化训练需求，因此建议先冻结 L1/L2 的设计输入，而不是马上决定具体开发板型号、自动采集模块或板级原理图。</w:t>
       </w:r>
     </w:p>
     <w:tbl>
@@ -2941,11 +2929,10 @@
                 <w:sz w:val="21"/>
               </w:rPr>
               <w:t>规划结论</w:t>
+              <w:br/>
+              <w:t>本项目可以进入 L1/L2 硬件化设计准备阶段。优先冻结实体操作、低压端子、普通仪表测量和手动录入闭环；自动采集作为后续扩展功能处理。开发板选型应在 IO 点表、端子分组、安全联锁和适配层字段初步稳定后再进行。</w:t>
             </w:r>
-            <w:r>
-              <w:br/>
-              <w:t>本项目可以进入 L1/L2 硬件化设计准备阶段。优先冻结 V1 的实体操作和手动测量闭环；V2 保持为选择性自动采集增强层。开发板选型应在 IO 点表、端子分组、安全联锁和适配层字段初步稳定后再进行。</w:t>
-            </w:r>
+            <w:r/>
           </w:p>
         </w:tc>
       </w:tr>
@@ -2970,11 +2957,7 @@
       <w:jc w:val="center"/>
     </w:pPr>
     <w:r>
-      <w:rPr>
-        <w:color w:val="808080"/>
-        <w:sz w:val="16"/>
-      </w:rPr>
-      <w:t>ThreePhase Hardware Replacement Plan · L1/L2 Focus</w:t>
+      <w:t>ThreePhase Hardware Replacement Plan · L1/L2 Manual Hardware Focus</w:t>
     </w:r>
   </w:p>
 </w:ftr>

</xml_diff>